<commit_message>
fix quarto formating issues
</commit_message>
<xml_diff>
--- a/docs/03-KlimaCheck-Schulhof/sushandreichung-klimacheck_planungsbewertung.docx
+++ b/docs/03-KlimaCheck-Schulhof/sushandreichung-klimacheck_planungsbewertung.docx
@@ -46,6 +46,14 @@
     <w:p>
       <w:pPr>
         <w:pStyle w:val="FirstParagraph"/>
+      </w:pPr>
+      <w:r>
+        <w:t xml:space="preserve">Im dieser Aufgabe prüft ihr die Planung der Stadt: Auf dem Schulhof sollen neue Sportflächen entstehen. Eure Aufgabe ist es, klimatologisch zu bewerten, ob diese Planung während der Schulzeit zu mehr oder weniger Hitzebelastung auf den freien Flächen führt.</w:t>
+      </w:r>
+    </w:p>
+    <w:p>
+      <w:pPr>
+        <w:pStyle w:val="BodyText"/>
       </w:pPr>
       <w:r>
         <w:rPr>
@@ -97,7 +105,7 @@
               <w:spacing w:before="16"/>
             </w:pPr>
             <w:r>
-              <w:t xml:space="preserve">Ihr untersucht mit dem Modell, wo es auf dem Schulhof während der Schulzeit besonders heiß wird.</w:t>
+              <w:t xml:space="preserve">Auf dem Schulhof wird es nicht überall gleich heiß. Ihr sucht im Modell die heißesten Stellen auf den freien Flächen: Wege, Rasen, Sand, Sportfeld, Pflaster und Asphalt.</w:t>
             </w:r>
           </w:p>
           <w:p>
@@ -105,7 +113,7 @@
               <w:pStyle w:val="BodyText"/>
             </w:pPr>
             <w:r>
-              <w:t xml:space="preserve">Wichtig sind die freien Flächen: Wege, Rasen, Sand, Sportfeld, Pflaster und Asphalt. Gebäude bewertet ihr nicht.</w:t>
+              <w:t xml:space="preserve">Wichtig ist die Schulzeit: Welche heißen Flächen liegen dort, wo sich Schüler*innen aufhalten können?</w:t>
             </w:r>
           </w:p>
           <w:p>
@@ -116,7 +124,7 @@
               <w:spacing w:after="16"/>
             </w:pPr>
             <w:r>
-              <w:t xml:space="preserve">Am Ende entscheidet ihr: Ist die geplante Umgestaltung sinnvoll?</w:t>
+              <w:t xml:space="preserve">Danach aktiviert ihr die geplante Umgestaltung und prüft, ob die Hitzebelastung besser oder schlechter wird. Am Ende entscheidet ihr: Soll die Planung so umgesetzt werden?</w:t>
             </w:r>
           </w:p>
         </w:tc>
@@ -281,7 +289,7 @@
         <w:pStyle w:val="FirstParagraph"/>
       </w:pPr>
       <w:r>
-        <w:t xml:space="preserve">Achtet nur auf die Flächen außerhalb der Gebäude.</w:t>
+        <w:t xml:space="preserve">Sucht zuerst die heißesten Stellen auf dem Schulhof. Achtet dabei nur auf Flächen außerhalb der Gebäude, also zum Beispiel Wege, Rasen, Sand, Sportflächen, Pflaster und Asphalt. Entscheidend ist nicht nur, wo es heiß wird, sondern ob diese Stellen während der Schulzeit für Schüler*innen wichtig sind.</w:t>
       </w:r>
     </w:p>
     <w:p>
@@ -317,7 +325,7 @@
         </w:numPr>
       </w:pPr>
       <w:r>
-        <w:t xml:space="preserve">Sind diese Hotspots während der Schulzeit wichtig?</w:t>
+        <w:t xml:space="preserve">Liegen diese Hotspots auf Flächen, die in der Schulzeit genutzt werden?</w:t>
       </w:r>
     </w:p>
     <w:p>
@@ -436,6 +444,14 @@
     <w:p>
       <w:pPr>
         <w:pStyle w:val="FirstParagraph"/>
+      </w:pPr>
+      <w:r>
+        <w:t xml:space="preserve">Die Stadt möchte den Schulhof verändern: Es sollen neue Sportflächen entstehen. Im Modell prüft ihr, ob diese Planung die Hitzebelastung während der Schulzeit verbessert oder verschlechtert.</w:t>
+      </w:r>
+    </w:p>
+    <w:p>
+      <w:pPr>
+        <w:pStyle w:val="BodyText"/>
       </w:pPr>
       <w:r>
         <w:t xml:space="preserve">Drückt</w:t>

</xml_diff>